<commit_message>
day10 A: A-P4 - D5's style names (PP Manufacturer Text, Label, Inline) in the generator and the renderer; the python-docx default thumbnail stripped from the templates; the furniture test reads the .docx templates' .rels for external targets instead of decoding them as text; the T1 twenty-three-cell list lifted to LISTED_CELLS for the DOCX round-trip
Co-Authored-By: Claude Fable 5.1 <noreply@anthropic.com>
</commit_message>
<xml_diff>
--- a/src/proofpack/templates/T1.docx
+++ b/src/proofpack/templates/T1.docx
@@ -106,7 +106,7 @@
           </w:p>
           <w:p>
             <w:pPr>
-              <w:pStyle w:val="PPCustomerTextLabel"/>
+              <w:pStyle w:val="PPManufacturerTextLabel"/>
             </w:pPr>
             <w:r>
               <w:t>Manufacturer text - manufacturer</w:t>
@@ -114,7 +114,7 @@
           </w:p>
           <w:p>
             <w:pPr>
-              <w:pStyle w:val="PPCustomerText"/>
+              <w:pStyle w:val="PPManufacturerText"/>
             </w:pPr>
             <w:r>
               <w:t>{{ slots["CT-01"].text }}</w:t>
@@ -198,7 +198,7 @@
           </w:tcPr>
           <w:p>
             <w:pPr>
-              <w:pStyle w:val="PPCustomerText"/>
+              <w:pStyle w:val="PPManufacturerText"/>
             </w:pPr>
             <w:r>
               <w:t>{{ model.name }} v{{ model.version }}</w:t>
@@ -947,7 +947,7 @@
           </w:tcPr>
           <w:p>
             <w:pPr>
-              <w:pStyle w:val="PPCustomerText"/>
+              <w:pStyle w:val="PPManufacturerText"/>
             </w:pPr>
             <w:r>
               <w:t>{{ row[1] }}</w:t>
@@ -1332,7 +1332,7 @@
           </w:tcPr>
           <w:p>
             <w:pPr>
-              <w:pStyle w:val="PPCustomerText"/>
+              <w:pStyle w:val="PPManufacturerText"/>
             </w:pPr>
             <w:r>
               <w:t>{{ r.attribute }}</w:t>
@@ -1345,7 +1345,7 @@
           </w:tcPr>
           <w:p>
             <w:pPr>
-              <w:pStyle w:val="PPCustomerText"/>
+              <w:pStyle w:val="PPManufacturerText"/>
             </w:pPr>
             <w:r>
               <w:t>{{ r.level }}</w:t>
@@ -2067,7 +2067,7 @@
     </w:tbl>
     <w:p>
       <w:pPr>
-        <w:pStyle w:val="PPCustomerTextLabel"/>
+        <w:pStyle w:val="PPManufacturerTextLabel"/>
       </w:pPr>
       <w:r>
         <w:t xml:space="preserve">Manufacturer text - </w:t>
@@ -2078,7 +2078,7 @@
     </w:p>
     <w:p>
       <w:pPr>
-        <w:pStyle w:val="PPCustomerText"/>
+        <w:pStyle w:val="PPManufacturerText"/>
       </w:pPr>
       <w:r>
         <w:t>{{ reference_standard.type }} ({{ reference_standard.description }})</w:t>
@@ -2271,7 +2271,7 @@
       </w:r>
       <w:r>
         <w:rPr>
-          <w:rStyle w:val="PPCustomerTextInline"/>
+          <w:rStyle w:val="PPManufacturerTextInline"/>
         </w:rPr>
         <w:t>{{ p.op }}</w:t>
       </w:r>
@@ -2285,7 +2285,7 @@
       </w:r>
       <w:r>
         <w:rPr>
-          <w:rStyle w:val="PPCustomerTextInline"/>
+          <w:rStyle w:val="PPManufacturerTextInline"/>
         </w:rPr>
         <w:t>{{ p.op }}</w:t>
       </w:r>
@@ -2294,7 +2294,7 @@
       </w:r>
       <w:r>
         <w:rPr>
-          <w:rStyle w:val="PPCustomerTextInline"/>
+          <w:rStyle w:val="PPManufacturerTextInline"/>
         </w:rPr>
         <w:t>{{ p.threshold }}</w:t>
       </w:r>
@@ -2707,7 +2707,7 @@
       </w:r>
       <w:r>
         <w:rPr>
-          <w:rStyle w:val="PPCustomerTextInline"/>
+          <w:rStyle w:val="PPManufacturerTextInline"/>
         </w:rPr>
         <w:t>{{ p.op }}</w:t>
       </w:r>
@@ -3081,7 +3081,7 @@
           </w:tcPr>
           <w:p>
             <w:pPr>
-              <w:pStyle w:val="PPCustomerText"/>
+              <w:pStyle w:val="PPManufacturerText"/>
             </w:pPr>
             <w:r>
               <w:t>{{ r.label }}</w:t>
@@ -4342,7 +4342,7 @@
     </w:p>
     <w:p>
       <w:pPr>
-        <w:pStyle w:val="PPCustomerTextLabel"/>
+        <w:pStyle w:val="PPManufacturerTextLabel"/>
       </w:pPr>
       <w:r>
         <w:t xml:space="preserve">Manufacturer text - </w:t>
@@ -4353,7 +4353,7 @@
     </w:p>
     <w:p>
       <w:pPr>
-        <w:pStyle w:val="PPCustomerText"/>
+        <w:pStyle w:val="PPManufacturerText"/>
       </w:pPr>
       <w:r>
         <w:t>{{ slots["CT-10"].text }}</w:t>
@@ -4391,7 +4391,7 @@
       </w:r>
       <w:r>
         <w:rPr>
-          <w:rStyle w:val="PPCustomerTextInline"/>
+          <w:rStyle w:val="PPManufacturerTextInline"/>
         </w:rPr>
         <w:t>{{ s.attribute }}</w:t>
       </w:r>
@@ -4410,7 +4410,7 @@
       </w:r>
       <w:r>
         <w:rPr>
-          <w:rStyle w:val="PPCustomerTextInline"/>
+          <w:rStyle w:val="PPManufacturerTextInline"/>
         </w:rPr>
         <w:t>{{ s.attribute }}</w:t>
       </w:r>
@@ -4419,7 +4419,7 @@
       </w:r>
       <w:r>
         <w:rPr>
-          <w:rStyle w:val="PPCustomerTextInline"/>
+          <w:rStyle w:val="PPManufacturerTextInline"/>
         </w:rPr>
         <w:t>{{ o.op }}</w:t>
       </w:r>
@@ -4428,7 +4428,7 @@
       </w:r>
       <w:r>
         <w:rPr>
-          <w:rStyle w:val="PPCustomerTextInline"/>
+          <w:rStyle w:val="PPManufacturerTextInline"/>
         </w:rPr>
         <w:t>{{ s.reference_level }}</w:t>
       </w:r>
@@ -4621,7 +4621,7 @@
           </w:tcPr>
           <w:p>
             <w:pPr>
-              <w:pStyle w:val="PPCustomerText"/>
+              <w:pStyle w:val="PPManufacturerText"/>
             </w:pPr>
             <w:r>
               <w:t>{{ r.level }}{% if r.is_reference %} (ref){% endif %}</w:t>
@@ -5028,7 +5028,7 @@
       </w:r>
       <w:r>
         <w:rPr>
-          <w:rStyle w:val="PPCustomerTextInline"/>
+          <w:rStyle w:val="PPManufacturerTextInline"/>
         </w:rPr>
         <w:t>{{ s.reference_level }}</w:t>
       </w:r>
@@ -5161,7 +5161,7 @@
           </w:tcPr>
           <w:p>
             <w:pPr>
-              <w:pStyle w:val="PPCustomerText"/>
+              <w:pStyle w:val="PPManufacturerText"/>
             </w:pPr>
             <w:r>
               <w:t>{{ d.level }}</w:t>
@@ -5223,7 +5223,7 @@
             </w:r>
             <w:r>
               <w:rPr>
-                <w:rStyle w:val="PPCustomerTextInline"/>
+                <w:rStyle w:val="PPManufacturerTextInline"/>
               </w:rPr>
               <w:t>{{ c.id }}</w:t>
             </w:r>
@@ -5681,7 +5681,7 @@
     </w:p>
     <w:p>
       <w:pPr>
-        <w:pStyle w:val="PPCustomerTextLabel"/>
+        <w:pStyle w:val="PPManufacturerTextLabel"/>
       </w:pPr>
       <w:r>
         <w:t xml:space="preserve">Manufacturer text - </w:t>
@@ -5692,7 +5692,7 @@
     </w:p>
     <w:p>
       <w:pPr>
-        <w:pStyle w:val="PPCustomerText"/>
+        <w:pStyle w:val="PPManufacturerText"/>
       </w:pPr>
       <w:r>
         <w:t>criterion of interest {{ fairness.criterion_of_interest }} on {{ fairness.attribute }}; {{ fairness.justification }}</w:t>
@@ -5707,7 +5707,7 @@
       </w:r>
       <w:r>
         <w:rPr>
-          <w:rStyle w:val="PPCustomerTextInline"/>
+          <w:rStyle w:val="PPManufacturerTextInline"/>
         </w:rPr>
         <w:t>{{ fairness.reference_level }}</w:t>
       </w:r>
@@ -5921,7 +5921,7 @@
           </w:tcPr>
           <w:p>
             <w:pPr>
-              <w:pStyle w:val="PPCustomerText"/>
+              <w:pStyle w:val="PPManufacturerText"/>
             </w:pPr>
             <w:r>
               <w:t>{{ g.level }}</w:t>
@@ -5934,7 +5934,7 @@
           </w:tcPr>
           <w:p>
             <w:pPr>
-              <w:pStyle w:val="PPCustomerText"/>
+              <w:pStyle w:val="PPManufacturerText"/>
             </w:pPr>
             <w:r>
               <w:t>{{ g.op }}</w:t>
@@ -6867,7 +6867,7 @@
           </w:tcPr>
           <w:p>
             <w:pPr>
-              <w:pStyle w:val="PPCustomerText"/>
+              <w:pStyle w:val="PPManufacturerText"/>
             </w:pPr>
             <w:r>
               <w:rPr>
@@ -6896,7 +6896,7 @@
           </w:tcPr>
           <w:p>
             <w:pPr>
-              <w:pStyle w:val="PPCustomerText"/>
+              <w:pStyle w:val="PPManufacturerText"/>
             </w:pPr>
             <w:r>
               <w:t>{{ r.scope }}</w:t>
@@ -6914,7 +6914,7 @@
           </w:p>
           <w:p>
             <w:pPr>
-              <w:pStyle w:val="PPCustomerText"/>
+              <w:pStyle w:val="PPManufacturerText"/>
             </w:pPr>
             <w:r>
               <w:t>{{ r.operating_point }}</w:t>
@@ -6985,7 +6985,7 @@
           </w:tcPr>
           <w:p>
             <w:pPr>
-              <w:pStyle w:val="PPCustomerText"/>
+              <w:pStyle w:val="PPManufacturerText"/>
             </w:pPr>
             <w:r>
               <w:t>{{ r.authored }}</w:t>
@@ -7256,7 +7256,7 @@
     </w:p>
     <w:p>
       <w:pPr>
-        <w:pStyle w:val="PPCustomerTextLabel"/>
+        <w:pStyle w:val="PPManufacturerTextLabel"/>
       </w:pPr>
       <w:r>
         <w:t xml:space="preserve">Manufacturer text - </w:t>
@@ -7267,7 +7267,7 @@
     </w:p>
     <w:p>
       <w:pPr>
-        <w:pStyle w:val="PPCustomerText"/>
+        <w:pStyle w:val="PPManufacturerText"/>
       </w:pPr>
       <w:r>
         <w:t>{{ r.justification }}</w:t>
@@ -8708,7 +8708,7 @@
     </w:pPr>
     <w:r>
       <w:rPr>
-        <w:rStyle w:val="PPCustomerTextInline"/>
+        <w:rStyle w:val="PPManufacturerTextInline"/>
       </w:rPr>
       <w:t>{{ header_customer }}</w:t>
     </w:r>
@@ -8727,7 +8727,7 @@
     </w:pPr>
     <w:r>
       <w:rPr>
-        <w:rStyle w:val="PPCustomerTextInline"/>
+        <w:rStyle w:val="PPManufacturerTextInline"/>
       </w:rPr>
       <w:t>{{ header_customer }}</w:t>
     </w:r>
@@ -8746,7 +8746,7 @@
     </w:pPr>
     <w:r>
       <w:rPr>
-        <w:rStyle w:val="PPCustomerTextInline"/>
+        <w:rStyle w:val="PPManufacturerTextInline"/>
       </w:rPr>
       <w:t>{{ header_customer }}</w:t>
     </w:r>
@@ -8765,7 +8765,7 @@
     </w:pPr>
     <w:r>
       <w:rPr>
-        <w:rStyle w:val="PPCustomerTextInline"/>
+        <w:rStyle w:val="PPManufacturerTextInline"/>
       </w:rPr>
       <w:t>{{ header_customer }}</w:t>
     </w:r>
@@ -8784,7 +8784,7 @@
     </w:pPr>
     <w:r>
       <w:rPr>
-        <w:rStyle w:val="PPCustomerTextInline"/>
+        <w:rStyle w:val="PPManufacturerTextInline"/>
       </w:rPr>
       <w:t>{{ header_customer }}</w:t>
     </w:r>
@@ -8803,7 +8803,7 @@
     </w:pPr>
     <w:r>
       <w:rPr>
-        <w:rStyle w:val="PPCustomerTextInline"/>
+        <w:rStyle w:val="PPManufacturerTextInline"/>
       </w:rPr>
       <w:t>{{ header_customer }}</w:t>
     </w:r>
@@ -8822,7 +8822,7 @@
     </w:pPr>
     <w:r>
       <w:rPr>
-        <w:rStyle w:val="PPCustomerTextInline"/>
+        <w:rStyle w:val="PPManufacturerTextInline"/>
       </w:rPr>
       <w:t>{{ header_customer }}</w:t>
     </w:r>
@@ -8841,7 +8841,7 @@
     </w:pPr>
     <w:r>
       <w:rPr>
-        <w:rStyle w:val="PPCustomerTextInline"/>
+        <w:rStyle w:val="PPManufacturerTextInline"/>
       </w:rPr>
       <w:t>{{ header_customer }}</w:t>
     </w:r>
@@ -8860,7 +8860,7 @@
     </w:pPr>
     <w:r>
       <w:rPr>
-        <w:rStyle w:val="PPCustomerTextInline"/>
+        <w:rStyle w:val="PPManufacturerTextInline"/>
       </w:rPr>
       <w:t>{{ header_customer }}</w:t>
     </w:r>
@@ -21019,8 +21019,8 @@
       <w:sz w:val="18"/>
     </w:rPr>
   </w:style>
-  <w:style w:type="paragraph" w:customStyle="1" w:styleId="PPCustomerText">
-    <w:name w:val="PP Customer Text"/>
+  <w:style w:type="paragraph" w:customStyle="1" w:styleId="PPManufacturerText">
+    <w:name w:val="PP Manufacturer Text"/>
     <w:basedOn w:val="Normal"/>
     <w:pPr>
       <w:pBdr>
@@ -21034,8 +21034,8 @@
       <w:sz w:val="22"/>
     </w:rPr>
   </w:style>
-  <w:style w:type="paragraph" w:customStyle="1" w:styleId="PPCustomerTextLabel">
-    <w:name w:val="PP Customer Text Label"/>
+  <w:style w:type="paragraph" w:customStyle="1" w:styleId="PPManufacturerTextLabel">
+    <w:name w:val="PP Manufacturer Text Label"/>
     <w:basedOn w:val="Normal"/>
     <w:pPr>
       <w:spacing w:after="0"/>
@@ -21146,8 +21146,8 @@
       <w:color w:val="16202B"/>
     </w:rPr>
   </w:style>
-  <w:style w:type="character" w:customStyle="1" w:styleId="PPCustomerTextInline">
-    <w:name w:val="PP Customer Text Inline"/>
+  <w:style w:type="character" w:customStyle="1" w:styleId="PPManufacturerTextInline">
+    <w:name w:val="PP Manufacturer Text Inline"/>
     <w:rPr>
       <w:color w:val="4A5A6A"/>
     </w:rPr>

</xml_diff>

<commit_message>
fix(engine): the defects the 11 October independent review confirmed (E1, E3 to E9, README)
E1 docx/stats install hints name the packages, not proofpack[docx]. E3 optional
y_pred_operating_point; H04 halts and says to declare it when y_pred meets several
operating points. E4 unquoted YAML dates read as ISO text. E5 model.version and
prior_version kept as written. E6 criteria schema closed throughout; an unknown key
halts H08 naming its path. E7 no engineering references (DEC ids, lens/repair numbers,
FA ids, script paths, spec section numbers) in customer-facing text; [unverified]
markings kept. E8 ledger.counted means this run added to the ledger; T8 prints what is
true. E9 auroc_wald description corrected. README status says sales opened 9 October.

Regression tests: tests/test_fix1011_engine.py (marker fix1011), 39 of 45 fail on b664500.
Needs a site ENGINE_REF pin move to reach buyers.

Co-Authored-By: Claude Opus 5.5 <noreply@anthropic.com>
</commit_message>
<xml_diff>
--- a/src/proofpack/templates/T1.docx
+++ b/src/proofpack/templates/T1.docx
@@ -1132,7 +1132,7 @@
         <w:pStyle w:val="PPCaption"/>
       </w:pPr>
       <w:r>
-        <w:t>Table T1-2 - flow of rows (D4 section 5.10)</w:t>
+        <w:t>Table T1-2 - flow of rows</w:t>
       </w:r>
     </w:p>
     <w:tbl>
@@ -1738,7 +1738,7 @@
         <w:pStyle w:val="PPBody"/>
       </w:pPr>
       <w:r>
-        <w:t>Table T1-5 is the site table of section 9 (per site, D4 section 5.3 format).</w:t>
+        <w:t>Table T1-5 is the site table of section 9 (one row per site).</w:t>
       </w:r>
     </w:p>
     <w:p>
@@ -3673,7 +3673,7 @@
         <w:pStyle w:val="PPCaption"/>
       </w:pPr>
       <w:r>
-        <w:t>Table T1-9 - calibration of the declared probability score (D4 section 5.5){% if calibration.curve_note %}; {{ calibration.curve_note }}{% endif %}</w:t>
+        <w:t>Table T1-9 - calibration of the declared probability score{% if calibration.curve_note %}; {{ calibration.curve_note }}{% endif %}</w:t>
       </w:r>
     </w:p>
     <w:tbl>
@@ -3832,7 +3832,7 @@
         <w:pStyle w:val="PPCaption"/>
       </w:pPr>
       <w:r>
-        <w:t>{% if calibration.ipa_tiers %}The IPA row's tier superscript ({{ calibration.ipa_tiers }}) is the proportion tier applied to the IPA's own interval: it states the half-width on the IPA's scale and nothing about a proportion (ProofPack reporting convention; T7, DEC-35).{% endif %}{% if calibration.ipa_tiers and calibration.clustered %} {% endif %}{% if calibration.clustered %}Under the clustered plan every interval above is a cluster-bootstrap interval and carries the mark ᵈ (coverage not established for its case sizes; legend in section 9); each cell keeps its tier annotation and the measured coverage of the route, including the one cell below the bar, is in T7 (DEC-18 (c), DEC-34).{% endif %}</w:t>
+        <w:t>{% if calibration.ipa_tiers %}The IPA row's tier superscript ({{ calibration.ipa_tiers }}) is the proportion tier applied to the IPA's own interval: it states the half-width on the IPA's scale and nothing about a proportion (ProofPack reporting convention; T7).{% endif %}{% if calibration.ipa_tiers and calibration.clustered %} {% endif %}{% if calibration.clustered %}Under the clustered plan every interval above is a cluster-bootstrap interval and carries the mark ᵈ (coverage not established for its case sizes; legend in section 9); each cell keeps its tier annotation and the measured coverage of the route, including the one cell below the bar, is in T7.{% endif %}</w:t>
       </w:r>
     </w:p>
     <w:p>
@@ -5412,7 +5412,7 @@
         <w:pStyle w:val="PPCaption"/>
       </w:pPr>
       <w:r>
-        <w:t>Tier superscripts - ProofPack reporting convention (R2 section 3.3); annotations, never suppression</w:t>
+        <w:t>Tier superscripts - ProofPack reporting convention; annotations, never suppression</w:t>
       </w:r>
     </w:p>
     <w:tbl>
@@ -6482,7 +6482,7 @@
         <w:pStyle w:val="PPCaption"/>
       </w:pPr>
       <w:r>
-        <w:t>One row per evaluated criterion, in the order the engine evaluated them (a criterion with level: * yields one row per level; rows are addressed by position, never by id, and each row's author, date and justification are those of the criteria.yaml entry it was evaluated from). Observed values print by the metric's rule of D4 section 1.2; the declared value prints with every digit run.json carries, unrounded; the compared statistic and the largest attainable lower bound, which the engine computed, print on the unit scale to three decimals. Status words are the engine's three and nothing else. The Type column is the declaration entry's type: a paired difference against the prior model version is a margin on the new-minus-prior difference, evaluated by proofpack compare, never a bound on the scope's own statistic.</w:t>
+        <w:t>One row per evaluated criterion, in the order the engine evaluated them (a criterion with level: * yields one row per level; rows are addressed by position, never by id, and each row's author, date and justification are those of the criteria.yaml entry it was evaluated from). Observed values print by the rule for the metric; the declared value prints with every digit run.json carries, unrounded; the compared statistic and the largest attainable lower bound, which the engine computed, print on the unit scale to three decimals. Status words are the engine's three and nothing else. The Type column is the declaration entry's type: a paired difference against the prior model version is a margin on the new-minus-prior difference, evaluated by proofpack compare, never a bound on the scope's own statistic.</w:t>
       </w:r>
     </w:p>
     <w:tbl>

</xml_diff>